<commit_message>
final tweaks and revisions (e.g., length reductions)
</commit_message>
<xml_diff>
--- a/manuscript-reference.docx
+++ b/manuscript-reference.docx
@@ -1211,8 +1211,8 @@
     <w:rPr>
       <w:rFonts w:ascii="Consolas" w:hAnsi="Consolas" w:cs="Consolas"/>
       <w:color w:val="555555"/>
-      <w:sz w:val="20"/>
-      <w:szCs w:val="20"/>
+      <w:sz w:val="18"/>
+      <w:szCs w:val="18"/>
     </w:rPr>
   </w:style>
 </w:styles>

</xml_diff>